<commit_message>
added content to document generation 21
</commit_message>
<xml_diff>
--- a/documentation/confidential/document generation session 21.docx
+++ b/documentation/confidential/document generation session 21.docx
@@ -5781,6 +5781,1812 @@
     <w:p>
       <w:r>
         <w:t>frontend/src/data/siteConfig.js</w:t>
+      </w:r>
+    </w:p>
+    <w:p/>
+    <w:p>
+      <w:r>
+        <w:t>i ran into an issue which is that when someone has an ad blocker or a tracking blocker or cookie blocker the site itself does not load so what can we do about that because the site needs to load google suggested renaming from cookie banner to consentnotice which i have no problem with but there must be a more permanent fix right ? btw ghostery is the extension that blocking this and i need to actually not block it also it just sticks on the splash screen</w:t>
+      </w:r>
+    </w:p>
+    <w:p/>
+    <w:p>
+      <w:r>
+        <w:t>i would also like help with instructions 9 and 10 on the testing checklist</w:t>
+      </w:r>
+    </w:p>
+    <w:p/>
+    <w:p>
+      <w:r>
+        <w:t>Designing a shared terms-version config and server-side gating logic</w:t>
+      </w:r>
+    </w:p>
+    <w:p>
+      <w:r>
+        <w:t>Your site is stuck on the splash screen because of one blocked file, not the cookie logic. That is my best diagnosis, and you can confirm it in 30 seconds.</w:t>
+      </w:r>
+    </w:p>
+    <w:p/>
+    <w:p>
+      <w:r>
+        <w:t>Confirm it: open the site with Ghostery on, press F12 and go to the Network tab, then reload. Look for a red request ending in CookieBanner.jsx or CookieBanner.css, with an error like net::ERR_BLOCKED_BY_CLIENT.</w:t>
+      </w:r>
+    </w:p>
+    <w:p/>
+    <w:p>
+      <w:r>
+        <w:lastRenderedPageBreak/>
+        <w:t>Why it happens: Ghostery and similar blockers match filenames and class names that contain words like “cookie” and “banner”. In development, Vite serves every component as its own file, and App.jsx imports the banner. When the blocker kills that one request, the whole module graph fails and React never mounts. The splash screen stays because nothing replaces it. A production build bundles everything into hashed files, so this is mostly a dev-mode problem. A blocker can still hide the bar visually, but the site would load.</w:t>
+      </w:r>
+    </w:p>
+    <w:p/>
+    <w:p>
+      <w:r>
+        <w:t>The permanent fix has two parts:</w:t>
+      </w:r>
+    </w:p>
+    <w:p/>
+    <w:p>
+      <w:r>
+        <w:t>Neutral names. This is Google’s rename suggestion, but I’d avoid “consent” too, since it also appears on filter lists. I’m using StorageNotice and sz-notice classes.</w:t>
+      </w:r>
+    </w:p>
+    <w:p>
+      <w:r>
+        <w:t>Make optional UI unable to break the app. The notice is loaded lazily inside an error boundary. If anything blocks it, that piece silently disappears and the rest of the site loads. This protects you from the next word a blocker decides to hate.</w:t>
+      </w:r>
+    </w:p>
+    <w:p>
+      <w:r>
+        <w:t>1. Rename and rebuild the notice</w:t>
+      </w:r>
+    </w:p>
+    <w:p>
+      <w:r>
+        <w:t>Delete the old folder frontend/src/components/CookieBanner/, then create these two files.</w:t>
+      </w:r>
+    </w:p>
+    <w:p/>
+    <w:p>
+      <w:r>
+        <w:t>New file: frontend/src/components/StorageNotice/StorageNotice.jsx</w:t>
+      </w:r>
+    </w:p>
+    <w:p/>
+    <w:p>
+      <w:r>
+        <w:t>jsx</w:t>
+      </w:r>
+    </w:p>
+    <w:p>
+      <w:r>
+        <w:t>// frontend/src/components/StorageNotice/StorageNotice.jsx</w:t>
+      </w:r>
+    </w:p>
+    <w:p>
+      <w:r>
+        <w:t>// ─────────────────────────────────────────────────────────────</w:t>
+      </w:r>
+    </w:p>
+    <w:p>
+      <w:r>
+        <w:t>// Browser-storage notice (formerly CookieBanner).</w:t>
+      </w:r>
+    </w:p>
+    <w:p>
+      <w:r>
+        <w:t>//</w:t>
+      </w:r>
+    </w:p>
+    <w:p>
+      <w:r>
+        <w:t>// RENAMED on purpose: ad/tracker blockers (Ghostery etc.) block files</w:t>
+      </w:r>
+    </w:p>
+    <w:p>
+      <w:r>
+        <w:t>// and classes named "cookie"/"banner"/"consent". In dev that blocked</w:t>
+      </w:r>
+    </w:p>
+    <w:p>
+      <w:r>
+        <w:t>// the module and left the whole site on the splash screen. Keep this</w:t>
+      </w:r>
+    </w:p>
+    <w:p>
+      <w:r>
+        <w:t>// name and the sz-notice classes neutral.</w:t>
+      </w:r>
+    </w:p>
+    <w:p>
+      <w:r>
+        <w:lastRenderedPageBreak/>
+        <w:t>//</w:t>
+      </w:r>
+    </w:p>
+    <w:p>
+      <w:r>
+        <w:t>// What it does:</w:t>
+      </w:r>
+    </w:p>
+    <w:p>
+      <w:r>
+        <w:t>//   - Shows once to a visitor who has not made a choice.</w:t>
+      </w:r>
+    </w:p>
+    <w:p>
+      <w:r>
+        <w:t>//   - "Accept all" or "Essential only", saved in localStorage.</w:t>
+      </w:r>
+    </w:p>
+    <w:p>
+      <w:r>
+        <w:t>//   - Exports getStorageChoice() so future analytics can check</w:t>
+      </w:r>
+    </w:p>
+    <w:p>
+      <w:r>
+        <w:t>//     permission before loading anything.</w:t>
+      </w:r>
+    </w:p>
+    <w:p>
+      <w:r>
+        <w:t>// The localStorage key keeps its old value so earlier choices survive.</w:t>
+      </w:r>
+    </w:p>
+    <w:p>
+      <w:r>
+        <w:t>//</w:t>
+      </w:r>
+    </w:p>
+    <w:p>
+      <w:r>
+        <w:t>// If analytics is ever added, update the cookie text in</w:t>
+      </w:r>
+    </w:p>
+    <w:p>
+      <w:r>
+        <w:t>// frontend/src/data/legalContent.js in the same pass (rule 97).</w:t>
+      </w:r>
+    </w:p>
+    <w:p>
+      <w:r>
+        <w:t>// ─────────────────────────────────────────────────────────────</w:t>
+      </w:r>
+    </w:p>
+    <w:p>
+      <w:r>
+        <w:t>import { useEffect, useState } from 'react';</w:t>
+      </w:r>
+    </w:p>
+    <w:p>
+      <w:r>
+        <w:t>import { Link } from 'react-router-dom';</w:t>
+      </w:r>
+    </w:p>
+    <w:p>
+      <w:r>
+        <w:t>import { FaCookieBite } from 'react-icons/fa';</w:t>
+      </w:r>
+    </w:p>
+    <w:p>
+      <w:r>
+        <w:t>import './StorageNotice.css';</w:t>
+      </w:r>
+    </w:p>
+    <w:p/>
+    <w:p>
+      <w:r>
+        <w:t>const STORAGE_KEY = 'shopzone_cookie_consent';</w:t>
+      </w:r>
+    </w:p>
+    <w:p/>
+    <w:p>
+      <w:r>
+        <w:t>/** Saved choice { choice: 'all' | 'essential', savedAt } or null. */</w:t>
+      </w:r>
+    </w:p>
+    <w:p>
+      <w:r>
+        <w:t>export const getStorageChoice = () =&gt; {</w:t>
+      </w:r>
+    </w:p>
+    <w:p>
+      <w:r>
+        <w:t xml:space="preserve">  try {</w:t>
+      </w:r>
+    </w:p>
+    <w:p>
+      <w:r>
+        <w:t xml:space="preserve">    const raw = localStorage.getItem(STORAGE_KEY);</w:t>
+      </w:r>
+    </w:p>
+    <w:p>
+      <w:r>
+        <w:t xml:space="preserve">    return raw ? JSON.parse(raw) : null;</w:t>
+      </w:r>
+    </w:p>
+    <w:p>
+      <w:r>
+        <w:t xml:space="preserve">  } catch {</w:t>
+      </w:r>
+    </w:p>
+    <w:p>
+      <w:r>
+        <w:t xml:space="preserve">    return null;</w:t>
+      </w:r>
+    </w:p>
+    <w:p>
+      <w:r>
+        <w:t xml:space="preserve">  }</w:t>
+      </w:r>
+    </w:p>
+    <w:p>
+      <w:r>
+        <w:lastRenderedPageBreak/>
+        <w:t>};</w:t>
+      </w:r>
+    </w:p>
+    <w:p/>
+    <w:p>
+      <w:r>
+        <w:t>const StorageNotice = () =&gt; {</w:t>
+      </w:r>
+    </w:p>
+    <w:p>
+      <w:r>
+        <w:t xml:space="preserve">  const [visible, setVisible] = useState(false);</w:t>
+      </w:r>
+    </w:p>
+    <w:p/>
+    <w:p>
+      <w:r>
+        <w:t xml:space="preserve">  useEffect(() =&gt; {</w:t>
+      </w:r>
+    </w:p>
+    <w:p>
+      <w:r>
+        <w:t xml:space="preserve">    if (getStorageChoice()) return;</w:t>
+      </w:r>
+    </w:p>
+    <w:p>
+      <w:r>
+        <w:t xml:space="preserve">    const t = setTimeout(() =&gt; setVisible(true), 800);</w:t>
+      </w:r>
+    </w:p>
+    <w:p>
+      <w:r>
+        <w:t xml:space="preserve">    return () =&gt; clearTimeout(t);</w:t>
+      </w:r>
+    </w:p>
+    <w:p>
+      <w:r>
+        <w:t xml:space="preserve">  }, []);</w:t>
+      </w:r>
+    </w:p>
+    <w:p/>
+    <w:p>
+      <w:r>
+        <w:t xml:space="preserve">  const choose = (choice) =&gt; {</w:t>
+      </w:r>
+    </w:p>
+    <w:p>
+      <w:r>
+        <w:t xml:space="preserve">    try {</w:t>
+      </w:r>
+    </w:p>
+    <w:p>
+      <w:r>
+        <w:t xml:space="preserve">      localStorage.setItem(</w:t>
+      </w:r>
+    </w:p>
+    <w:p>
+      <w:r>
+        <w:t xml:space="preserve">        STORAGE_KEY,</w:t>
+      </w:r>
+    </w:p>
+    <w:p>
+      <w:r>
+        <w:t xml:space="preserve">        JSON.stringify({ choice, savedAt: new Date().toISOString() })</w:t>
+      </w:r>
+    </w:p>
+    <w:p>
+      <w:r>
+        <w:t xml:space="preserve">      );</w:t>
+      </w:r>
+    </w:p>
+    <w:p>
+      <w:r>
+        <w:t xml:space="preserve">    } catch {</w:t>
+      </w:r>
+    </w:p>
+    <w:p>
+      <w:r>
+        <w:t xml:space="preserve">      /* storage blocked: the notice just hides for this visit */</w:t>
+      </w:r>
+    </w:p>
+    <w:p>
+      <w:r>
+        <w:t xml:space="preserve">    }</w:t>
+      </w:r>
+    </w:p>
+    <w:p>
+      <w:r>
+        <w:t xml:space="preserve">    setVisible(false);</w:t>
+      </w:r>
+    </w:p>
+    <w:p>
+      <w:r>
+        <w:t xml:space="preserve">  };</w:t>
+      </w:r>
+    </w:p>
+    <w:p/>
+    <w:p>
+      <w:r>
+        <w:t xml:space="preserve">  if (!visible) return null;</w:t>
+      </w:r>
+    </w:p>
+    <w:p/>
+    <w:p>
+      <w:r>
+        <w:t xml:space="preserve">  return (</w:t>
+      </w:r>
+    </w:p>
+    <w:p>
+      <w:r>
+        <w:lastRenderedPageBreak/>
+        <w:t xml:space="preserve">    &lt;div className='sz-notice' role='dialog' aria-label='Storage notice' aria-live='polite'&gt;</w:t>
+      </w:r>
+    </w:p>
+    <w:p>
+      <w:r>
+        <w:t xml:space="preserve">      &lt;FaCookieBite className='sz-notice__icon' aria-hidden='true' /&gt;</w:t>
+      </w:r>
+    </w:p>
+    <w:p/>
+    <w:p>
+      <w:r>
+        <w:t xml:space="preserve">      &lt;p className='sz-notice__text'&gt;</w:t>
+      </w:r>
+    </w:p>
+    <w:p>
+      <w:r>
+        <w:t xml:space="preserve">        We use essential cookies and browser storage to keep you signed in and</w:t>
+      </w:r>
+    </w:p>
+    <w:p>
+      <w:r>
+        <w:t xml:space="preserve">        remember your cart. See our{' '}</w:t>
+      </w:r>
+    </w:p>
+    <w:p>
+      <w:r>
+        <w:t xml:space="preserve">        &lt;Link to='/cookie-policy' className='sz-notice__link'&gt;Cookie Policy&lt;/Link&gt;.</w:t>
+      </w:r>
+    </w:p>
+    <w:p>
+      <w:r>
+        <w:t xml:space="preserve">      &lt;/p&gt;</w:t>
+      </w:r>
+    </w:p>
+    <w:p/>
+    <w:p>
+      <w:r>
+        <w:t xml:space="preserve">      &lt;div className='sz-notice__actions'&gt;</w:t>
+      </w:r>
+    </w:p>
+    <w:p>
+      <w:r>
+        <w:t xml:space="preserve">        &lt;button type='button' className='sz-notice__btn sz-notice__btn--ghost' onClick={() =&gt; choose('essential')}&gt;</w:t>
+      </w:r>
+    </w:p>
+    <w:p>
+      <w:r>
+        <w:t xml:space="preserve">          Essential only</w:t>
+      </w:r>
+    </w:p>
+    <w:p>
+      <w:r>
+        <w:t xml:space="preserve">        &lt;/button&gt;</w:t>
+      </w:r>
+    </w:p>
+    <w:p>
+      <w:r>
+        <w:t xml:space="preserve">        &lt;button type='button' className='sz-notice__btn sz-notice__btn--primary' onClick={() =&gt; choose('all')}&gt;</w:t>
+      </w:r>
+    </w:p>
+    <w:p>
+      <w:r>
+        <w:t xml:space="preserve">          Accept all</w:t>
+      </w:r>
+    </w:p>
+    <w:p>
+      <w:r>
+        <w:t xml:space="preserve">        &lt;/button&gt;</w:t>
+      </w:r>
+    </w:p>
+    <w:p>
+      <w:r>
+        <w:t xml:space="preserve">      &lt;/div&gt;</w:t>
+      </w:r>
+    </w:p>
+    <w:p>
+      <w:r>
+        <w:t xml:space="preserve">    &lt;/div&gt;</w:t>
+      </w:r>
+    </w:p>
+    <w:p>
+      <w:r>
+        <w:t xml:space="preserve">  );</w:t>
+      </w:r>
+    </w:p>
+    <w:p>
+      <w:r>
+        <w:t>};</w:t>
+      </w:r>
+    </w:p>
+    <w:p/>
+    <w:p>
+      <w:r>
+        <w:t>export default StorageNotice;</w:t>
+      </w:r>
+    </w:p>
+    <w:p>
+      <w:r>
+        <w:t>New file: frontend/src/components/StorageNotice/StorageNotice.css</w:t>
+      </w:r>
+    </w:p>
+    <w:p/>
+    <w:p>
+      <w:r>
+        <w:t>css</w:t>
+      </w:r>
+    </w:p>
+    <w:p>
+      <w:r>
+        <w:lastRenderedPageBreak/>
+        <w:t>/* frontend/src/components/StorageNotice/StorageNotice.css</w:t>
+      </w:r>
+    </w:p>
+    <w:p>
+      <w:r>
+        <w:t xml:space="preserve">   z-index 1045: above content, below the bottom tab bar (1050).</w:t>
+      </w:r>
+    </w:p>
+    <w:p>
+      <w:r>
+        <w:t xml:space="preserve">   Lifts above the bar at 991px and below (rule 94).</w:t>
+      </w:r>
+    </w:p>
+    <w:p>
+      <w:r>
+        <w:t xml:space="preserve">   Text is explicitly white (a global p rule was making it black). */</w:t>
+      </w:r>
+    </w:p>
+    <w:p/>
+    <w:p>
+      <w:r>
+        <w:t>.sz-notice {</w:t>
+      </w:r>
+    </w:p>
+    <w:p>
+      <w:r>
+        <w:t xml:space="preserve">  position: fixed;</w:t>
+      </w:r>
+    </w:p>
+    <w:p>
+      <w:r>
+        <w:t xml:space="preserve">  left: 50%;</w:t>
+      </w:r>
+    </w:p>
+    <w:p>
+      <w:r>
+        <w:t xml:space="preserve">  bottom: 16px;</w:t>
+      </w:r>
+    </w:p>
+    <w:p>
+      <w:r>
+        <w:t xml:space="preserve">  transform: translateX(-50%);</w:t>
+      </w:r>
+    </w:p>
+    <w:p>
+      <w:r>
+        <w:t xml:space="preserve">  z-index: 1045;</w:t>
+      </w:r>
+    </w:p>
+    <w:p>
+      <w:r>
+        <w:t xml:space="preserve">  width: min(720px, calc(100vw - 24px));</w:t>
+      </w:r>
+    </w:p>
+    <w:p>
+      <w:r>
+        <w:t xml:space="preserve">  display: flex;</w:t>
+      </w:r>
+    </w:p>
+    <w:p>
+      <w:r>
+        <w:t xml:space="preserve">  align-items: center;</w:t>
+      </w:r>
+    </w:p>
+    <w:p>
+      <w:r>
+        <w:t xml:space="preserve">  gap: 14px;</w:t>
+      </w:r>
+    </w:p>
+    <w:p>
+      <w:r>
+        <w:t xml:space="preserve">  padding: 12px 16px;</w:t>
+      </w:r>
+    </w:p>
+    <w:p>
+      <w:r>
+        <w:t xml:space="preserve">  background: var(--oxford-blue);</w:t>
+      </w:r>
+    </w:p>
+    <w:p>
+      <w:r>
+        <w:t xml:space="preserve">  border: 1px solid rgba(210, 180, 140, 0.35);</w:t>
+      </w:r>
+    </w:p>
+    <w:p>
+      <w:r>
+        <w:t xml:space="preserve">  border-radius: 14px;</w:t>
+      </w:r>
+    </w:p>
+    <w:p>
+      <w:r>
+        <w:t xml:space="preserve">  box-shadow: 0 8px 28px rgba(0, 33, 71, 0.35);</w:t>
+      </w:r>
+    </w:p>
+    <w:p>
+      <w:r>
+        <w:t xml:space="preserve">  animation: sz-notice-in 0.35s ease both;</w:t>
+      </w:r>
+    </w:p>
+    <w:p>
+      <w:r>
+        <w:t>}</w:t>
+      </w:r>
+    </w:p>
+    <w:p/>
+    <w:p>
+      <w:r>
+        <w:t>.sz-notice__icon {</w:t>
+      </w:r>
+    </w:p>
+    <w:p>
+      <w:r>
+        <w:t xml:space="preserve">  flex-shrink: 0;</w:t>
+      </w:r>
+    </w:p>
+    <w:p>
+      <w:r>
+        <w:t xml:space="preserve">  font-size: 1.4rem;</w:t>
+      </w:r>
+    </w:p>
+    <w:p>
+      <w:r>
+        <w:lastRenderedPageBreak/>
+        <w:t xml:space="preserve">  color: var(--tan);</w:t>
+      </w:r>
+    </w:p>
+    <w:p>
+      <w:r>
+        <w:t>}</w:t>
+      </w:r>
+    </w:p>
+    <w:p/>
+    <w:p>
+      <w:r>
+        <w:t>.sz-notice .sz-notice__text {</w:t>
+      </w:r>
+    </w:p>
+    <w:p>
+      <w:r>
+        <w:t xml:space="preserve">  flex: 1;</w:t>
+      </w:r>
+    </w:p>
+    <w:p>
+      <w:r>
+        <w:t xml:space="preserve">  margin: 0;</w:t>
+      </w:r>
+    </w:p>
+    <w:p>
+      <w:r>
+        <w:t xml:space="preserve">  font-size: 0.82rem;</w:t>
+      </w:r>
+    </w:p>
+    <w:p>
+      <w:r>
+        <w:t xml:space="preserve">  line-height: 1.5;</w:t>
+      </w:r>
+    </w:p>
+    <w:p>
+      <w:r>
+        <w:t xml:space="preserve">  color: #ffffff;</w:t>
+      </w:r>
+    </w:p>
+    <w:p>
+      <w:r>
+        <w:t>}</w:t>
+      </w:r>
+    </w:p>
+    <w:p/>
+    <w:p>
+      <w:r>
+        <w:t>.sz-notice .sz-notice__link {</w:t>
+      </w:r>
+    </w:p>
+    <w:p>
+      <w:r>
+        <w:t xml:space="preserve">  color: var(--tan);</w:t>
+      </w:r>
+    </w:p>
+    <w:p>
+      <w:r>
+        <w:t xml:space="preserve">  text-decoration: underline;</w:t>
+      </w:r>
+    </w:p>
+    <w:p>
+      <w:r>
+        <w:t xml:space="preserve">  text-underline-offset: 2px;</w:t>
+      </w:r>
+    </w:p>
+    <w:p>
+      <w:r>
+        <w:t>}</w:t>
+      </w:r>
+    </w:p>
+    <w:p/>
+    <w:p>
+      <w:r>
+        <w:t>.sz-notice__actions {</w:t>
+      </w:r>
+    </w:p>
+    <w:p>
+      <w:r>
+        <w:t xml:space="preserve">  display: flex;</w:t>
+      </w:r>
+    </w:p>
+    <w:p>
+      <w:r>
+        <w:t xml:space="preserve">  gap: 8px;</w:t>
+      </w:r>
+    </w:p>
+    <w:p>
+      <w:r>
+        <w:t xml:space="preserve">  flex-shrink: 0;</w:t>
+      </w:r>
+    </w:p>
+    <w:p>
+      <w:r>
+        <w:t>}</w:t>
+      </w:r>
+    </w:p>
+    <w:p/>
+    <w:p>
+      <w:r>
+        <w:t>.sz-notice__btn {</w:t>
+      </w:r>
+    </w:p>
+    <w:p>
+      <w:r>
+        <w:t xml:space="preserve">  font-family: inherit;</w:t>
+      </w:r>
+    </w:p>
+    <w:p>
+      <w:r>
+        <w:t xml:space="preserve">  font-size: 0.78rem;</w:t>
+      </w:r>
+    </w:p>
+    <w:p>
+      <w:r>
+        <w:lastRenderedPageBreak/>
+        <w:t xml:space="preserve">  font-weight: 700;</w:t>
+      </w:r>
+    </w:p>
+    <w:p>
+      <w:r>
+        <w:t xml:space="preserve">  padding: 8px 14px;</w:t>
+      </w:r>
+    </w:p>
+    <w:p>
+      <w:r>
+        <w:t xml:space="preserve">  border-radius: 8px;</w:t>
+      </w:r>
+    </w:p>
+    <w:p>
+      <w:r>
+        <w:t xml:space="preserve">  cursor: pointer;</w:t>
+      </w:r>
+    </w:p>
+    <w:p>
+      <w:r>
+        <w:t xml:space="preserve">  white-space: nowrap;</w:t>
+      </w:r>
+    </w:p>
+    <w:p>
+      <w:r>
+        <w:t xml:space="preserve">  transition: opacity 0.15s;</w:t>
+      </w:r>
+    </w:p>
+    <w:p>
+      <w:r>
+        <w:t>}</w:t>
+      </w:r>
+    </w:p>
+    <w:p/>
+    <w:p>
+      <w:r>
+        <w:t>.sz-notice__btn:hover { opacity: 0.88; }</w:t>
+      </w:r>
+    </w:p>
+    <w:p>
+      <w:r>
+        <w:t>.sz-notice__btn:focus-visible { outline: 2px solid var(--tan); outline-offset: 2px; }</w:t>
+      </w:r>
+    </w:p>
+    <w:p/>
+    <w:p>
+      <w:r>
+        <w:t>.sz-notice .sz-notice__btn--primary {</w:t>
+      </w:r>
+    </w:p>
+    <w:p>
+      <w:r>
+        <w:t xml:space="preserve">  background: var(--tan);</w:t>
+      </w:r>
+    </w:p>
+    <w:p>
+      <w:r>
+        <w:t xml:space="preserve">  color: var(--oxford-blue);</w:t>
+      </w:r>
+    </w:p>
+    <w:p>
+      <w:r>
+        <w:t xml:space="preserve">  border: 1px solid var(--tan);</w:t>
+      </w:r>
+    </w:p>
+    <w:p>
+      <w:r>
+        <w:t>}</w:t>
+      </w:r>
+    </w:p>
+    <w:p/>
+    <w:p>
+      <w:r>
+        <w:t>.sz-notice .sz-notice__btn--ghost {</w:t>
+      </w:r>
+    </w:p>
+    <w:p>
+      <w:r>
+        <w:t xml:space="preserve">  background: transparent;</w:t>
+      </w:r>
+    </w:p>
+    <w:p>
+      <w:r>
+        <w:t xml:space="preserve">  color: #ffffff;</w:t>
+      </w:r>
+    </w:p>
+    <w:p>
+      <w:r>
+        <w:t xml:space="preserve">  border: 1px solid rgba(255, 255, 255, 0.55);</w:t>
+      </w:r>
+    </w:p>
+    <w:p>
+      <w:r>
+        <w:t>}</w:t>
+      </w:r>
+    </w:p>
+    <w:p/>
+    <w:p>
+      <w:r>
+        <w:t>@keyframes sz-notice-in {</w:t>
+      </w:r>
+    </w:p>
+    <w:p>
+      <w:r>
+        <w:t xml:space="preserve">  from { opacity: 0; transform: translate(-50%, 12px); }</w:t>
+      </w:r>
+    </w:p>
+    <w:p>
+      <w:r>
+        <w:t xml:space="preserve">  to   { opacity: 1; transform: translate(-50%, 0); }</w:t>
+      </w:r>
+    </w:p>
+    <w:p>
+      <w:r>
+        <w:lastRenderedPageBreak/>
+        <w:t>}</w:t>
+      </w:r>
+    </w:p>
+    <w:p/>
+    <w:p>
+      <w:r>
+        <w:t>@media (max-width: 991px) {</w:t>
+      </w:r>
+    </w:p>
+    <w:p>
+      <w:r>
+        <w:t xml:space="preserve">  .sz-notice {</w:t>
+      </w:r>
+    </w:p>
+    <w:p>
+      <w:r>
+        <w:t xml:space="preserve">    bottom: calc(var(--bottom-nav-height, 62px) + 10px + env(safe-area-inset-bottom, 0px));</w:t>
+      </w:r>
+    </w:p>
+    <w:p>
+      <w:r>
+        <w:t xml:space="preserve">  }</w:t>
+      </w:r>
+    </w:p>
+    <w:p>
+      <w:r>
+        <w:t>}</w:t>
+      </w:r>
+    </w:p>
+    <w:p/>
+    <w:p>
+      <w:r>
+        <w:t>@media (max-width: 600px) {</w:t>
+      </w:r>
+    </w:p>
+    <w:p>
+      <w:r>
+        <w:t xml:space="preserve">  .sz-notice { flex-wrap: wrap; gap: 10px; padding: 12px; }</w:t>
+      </w:r>
+    </w:p>
+    <w:p>
+      <w:r>
+        <w:t xml:space="preserve">  .sz-notice .sz-notice__text { flex-basis: calc(100% - 40px); }</w:t>
+      </w:r>
+    </w:p>
+    <w:p>
+      <w:r>
+        <w:t xml:space="preserve">  .sz-notice__actions { width: 100%; }</w:t>
+      </w:r>
+    </w:p>
+    <w:p>
+      <w:r>
+        <w:t xml:space="preserve">  .sz-notice__btn { flex: 1; padding: 10px 12px; }</w:t>
+      </w:r>
+    </w:p>
+    <w:p>
+      <w:r>
+        <w:t>}</w:t>
+      </w:r>
+    </w:p>
+    <w:p>
+      <w:r>
+        <w:t>2. The safety net</w:t>
+      </w:r>
+    </w:p>
+    <w:p>
+      <w:r>
+        <w:t>New file: frontend/src/components/OptionalBoundary/OptionalBoundary.jsx</w:t>
+      </w:r>
+    </w:p>
+    <w:p/>
+    <w:p>
+      <w:r>
+        <w:t>This component has no visual output, so it has no CSS file.</w:t>
+      </w:r>
+    </w:p>
+    <w:p/>
+    <w:p>
+      <w:r>
+        <w:t>jsx</w:t>
+      </w:r>
+    </w:p>
+    <w:p>
+      <w:r>
+        <w:t>// frontend/src/components/OptionalBoundary/OptionalBoundary.jsx</w:t>
+      </w:r>
+    </w:p>
+    <w:p>
+      <w:r>
+        <w:t>// ─────────────────────────────────────────────────────────────</w:t>
+      </w:r>
+    </w:p>
+    <w:p>
+      <w:r>
+        <w:t>// Wraps NON-ESSENTIAL UI (notices, widgets) so that if it fails to</w:t>
+      </w:r>
+    </w:p>
+    <w:p>
+      <w:r>
+        <w:t>// load or crashes, it silently renders nothing instead of taking the</w:t>
+      </w:r>
+    </w:p>
+    <w:p>
+      <w:r>
+        <w:t>// whole app down. Needed because ad/tracker blockers can block a</w:t>
+      </w:r>
+    </w:p>
+    <w:p>
+      <w:r>
+        <w:t>// component's file, and a failed lazy import throws during render.</w:t>
+      </w:r>
+    </w:p>
+    <w:p>
+      <w:r>
+        <w:lastRenderedPageBreak/>
+        <w:t>//</w:t>
+      </w:r>
+    </w:p>
+    <w:p>
+      <w:r>
+        <w:t>// Use with React.lazy:</w:t>
+      </w:r>
+    </w:p>
+    <w:p>
+      <w:r>
+        <w:t>//   &lt;OptionalBoundary&gt;&lt;Suspense fallback={null}&gt;&lt;Thing /&gt;&lt;/Suspense&gt;&lt;/OptionalBoundary&gt;</w:t>
+      </w:r>
+    </w:p>
+    <w:p>
+      <w:r>
+        <w:t>// Never wrap essential UI (header, routes, checkout) in this.</w:t>
+      </w:r>
+    </w:p>
+    <w:p>
+      <w:r>
+        <w:t>// ─────────────────────────────────────────────────────────────</w:t>
+      </w:r>
+    </w:p>
+    <w:p>
+      <w:r>
+        <w:t>import { Component } from 'react';</w:t>
+      </w:r>
+    </w:p>
+    <w:p/>
+    <w:p>
+      <w:r>
+        <w:t>class OptionalBoundary extends Component {</w:t>
+      </w:r>
+    </w:p>
+    <w:p>
+      <w:r>
+        <w:t xml:space="preserve">  state = { failed: false };</w:t>
+      </w:r>
+    </w:p>
+    <w:p/>
+    <w:p>
+      <w:r>
+        <w:t xml:space="preserve">  static getDerivedStateFromError() {</w:t>
+      </w:r>
+    </w:p>
+    <w:p>
+      <w:r>
+        <w:t xml:space="preserve">    return { failed: true };</w:t>
+      </w:r>
+    </w:p>
+    <w:p>
+      <w:r>
+        <w:t xml:space="preserve">  }</w:t>
+      </w:r>
+    </w:p>
+    <w:p/>
+    <w:p>
+      <w:r>
+        <w:t xml:space="preserve">  componentDidCatch(error) {</w:t>
+      </w:r>
+    </w:p>
+    <w:p>
+      <w:r>
+        <w:t xml:space="preserve">    console.warn('Optional component failed to load (an extension may have blocked it):', error?.message);</w:t>
+      </w:r>
+    </w:p>
+    <w:p>
+      <w:r>
+        <w:t xml:space="preserve">  }</w:t>
+      </w:r>
+    </w:p>
+    <w:p/>
+    <w:p>
+      <w:r>
+        <w:t xml:space="preserve">  render() {</w:t>
+      </w:r>
+    </w:p>
+    <w:p>
+      <w:r>
+        <w:t xml:space="preserve">    return this.state.failed ? null : this.props.children;</w:t>
+      </w:r>
+    </w:p>
+    <w:p>
+      <w:r>
+        <w:t xml:space="preserve">  }</w:t>
+      </w:r>
+    </w:p>
+    <w:p>
+      <w:r>
+        <w:t>}</w:t>
+      </w:r>
+    </w:p>
+    <w:p/>
+    <w:p>
+      <w:r>
+        <w:t>export default OptionalBoundary;</w:t>
+      </w:r>
+    </w:p>
+    <w:p>
+      <w:r>
+        <w:t>3. frontend/src/App.jsx</w:t>
+      </w:r>
+    </w:p>
+    <w:p>
+      <w:r>
+        <w:lastRenderedPageBreak/>
+        <w:t>Find this in frontend/src/App.jsx:</w:t>
+      </w:r>
+    </w:p>
+    <w:p/>
+    <w:p>
+      <w:r>
+        <w:t>jsx</w:t>
+      </w:r>
+    </w:p>
+    <w:p>
+      <w:r>
+        <w:t>import { BrowserRouter as Router, Routes, Route, useNavigate } from 'react-router-dom';</w:t>
+      </w:r>
+    </w:p>
+    <w:p>
+      <w:r>
+        <w:t>Replace with:</w:t>
+      </w:r>
+    </w:p>
+    <w:p/>
+    <w:p>
+      <w:r>
+        <w:t>jsx</w:t>
+      </w:r>
+    </w:p>
+    <w:p>
+      <w:r>
+        <w:t>import { lazy, Suspense } from 'react';</w:t>
+      </w:r>
+    </w:p>
+    <w:p>
+      <w:r>
+        <w:t>import { BrowserRouter as Router, Routes, Route, useNavigate } from 'react-router-dom';</w:t>
+      </w:r>
+    </w:p>
+    <w:p>
+      <w:r>
+        <w:t>Find this in frontend/src/App.jsx:</w:t>
+      </w:r>
+    </w:p>
+    <w:p/>
+    <w:p>
+      <w:r>
+        <w:t>jsx</w:t>
+      </w:r>
+    </w:p>
+    <w:p>
+      <w:r>
+        <w:t>import CookieBanner from './components/CookieBanner/CookieBanner';</w:t>
+      </w:r>
+    </w:p>
+    <w:p>
+      <w:r>
+        <w:t>Replace with:</w:t>
+      </w:r>
+    </w:p>
+    <w:p/>
+    <w:p>
+      <w:r>
+        <w:t>jsx</w:t>
+      </w:r>
+    </w:p>
+    <w:p>
+      <w:r>
+        <w:t>import OptionalBoundary from './components/OptionalBoundary/OptionalBoundary';</w:t>
+      </w:r>
+    </w:p>
+    <w:p>
+      <w:r>
+        <w:t>// Lazy + boundary: a blocker killing this file can no longer stop the app mounting</w:t>
+      </w:r>
+    </w:p>
+    <w:p>
+      <w:r>
+        <w:t>const StorageNotice = lazy(() =&gt; import('./components/StorageNotice/StorageNotice'));</w:t>
+      </w:r>
+    </w:p>
+    <w:p>
+      <w:r>
+        <w:t>Find this in frontend/src/App.jsx:</w:t>
+      </w:r>
+    </w:p>
+    <w:p/>
+    <w:p>
+      <w:r>
+        <w:t>jsx</w:t>
+      </w:r>
+    </w:p>
+    <w:p>
+      <w:r>
+        <w:t xml:space="preserve">      {/* Cookie consent bar: fixed overlay, shows once until a choice is saved */}</w:t>
+      </w:r>
+    </w:p>
+    <w:p>
+      <w:r>
+        <w:t xml:space="preserve">      &lt;CookieBanner /&gt;</w:t>
+      </w:r>
+    </w:p>
+    <w:p>
+      <w:r>
+        <w:t>Replace with:</w:t>
+      </w:r>
+    </w:p>
+    <w:p/>
+    <w:p>
+      <w:r>
+        <w:lastRenderedPageBreak/>
+        <w:t>jsx</w:t>
+      </w:r>
+    </w:p>
+    <w:p>
+      <w:r>
+        <w:t xml:space="preserve">      {/* Storage notice: optional overlay, isolated so a blocker cannot break the app */}</w:t>
+      </w:r>
+    </w:p>
+    <w:p>
+      <w:r>
+        <w:t xml:space="preserve">      &lt;OptionalBoundary&gt;</w:t>
+      </w:r>
+    </w:p>
+    <w:p>
+      <w:r>
+        <w:t xml:space="preserve">        &lt;Suspense fallback={null}&gt;</w:t>
+      </w:r>
+    </w:p>
+    <w:p>
+      <w:r>
+        <w:t xml:space="preserve">          &lt;StorageNotice /&gt;</w:t>
+      </w:r>
+    </w:p>
+    <w:p>
+      <w:r>
+        <w:t xml:space="preserve">        &lt;/Suspense&gt;</w:t>
+      </w:r>
+    </w:p>
+    <w:p>
+      <w:r>
+        <w:t xml:space="preserve">      &lt;/OptionalBoundary&gt;</w:t>
+      </w:r>
+    </w:p>
+    <w:p>
+      <w:r>
+        <w:t>I’m leaving TermsUpdateModal alone. PlaceOrderPage and BecomeSellerPage import it statically, and its name isn’t something blockers target. If the site still sticks after this fix, the Network tab will show the next blocked file, and I’ll isolate that one too.</w:t>
+      </w:r>
+    </w:p>
+    <w:p/>
+    <w:p>
+      <w:r>
+        <w:t>4. Server-side Terms gate (ISS-091, still owed)</w:t>
+      </w:r>
+    </w:p>
+    <w:p>
+      <w:r>
+        <w:t>You pasted the three files for this. The version constant moves into one shared file so the controllers can’t drift apart.</w:t>
+      </w:r>
+    </w:p>
+    <w:p/>
+    <w:p>
+      <w:r>
+        <w:t>New file: backend/config/terms.js (create the config folder if you don’t have one)</w:t>
+      </w:r>
+    </w:p>
+    <w:p/>
+    <w:p>
+      <w:r>
+        <w:t>js</w:t>
+      </w:r>
+    </w:p>
+    <w:p>
+      <w:r>
+        <w:t>// backend/config/terms.js</w:t>
+      </w:r>
+    </w:p>
+    <w:p>
+      <w:r>
+        <w:t>// ─────────────────────────────────────────────────────────────</w:t>
+      </w:r>
+    </w:p>
+    <w:p>
+      <w:r>
+        <w:t>// Single source of truth for the current Terms version (ISS-091).</w:t>
+      </w:r>
+    </w:p>
+    <w:p>
+      <w:r>
+        <w:t>// Bump this whenever the Terms of Service or Privacy Policy change</w:t>
+      </w:r>
+    </w:p>
+    <w:p>
+      <w:r>
+        <w:t>// materially, and update legalLastUpdated in</w:t>
+      </w:r>
+    </w:p>
+    <w:p>
+      <w:r>
+        <w:t>// frontend/src/data/siteConfig.js at the same time. Every account</w:t>
+      </w:r>
+    </w:p>
+    <w:p>
+      <w:r>
+        <w:t>// whose stored termsVersion differs is prompted to accept again and</w:t>
+      </w:r>
+    </w:p>
+    <w:p>
+      <w:r>
+        <w:t>// is blocked from placing orders or applying as a seller until it does.</w:t>
+      </w:r>
+    </w:p>
+    <w:p>
+      <w:r>
+        <w:t>// ─────────────────────────────────────────────────────────────</w:t>
+      </w:r>
+    </w:p>
+    <w:p>
+      <w:r>
+        <w:lastRenderedPageBreak/>
+        <w:t>const TERMS_VERSION = '2026-10-24';</w:t>
+      </w:r>
+    </w:p>
+    <w:p/>
+    <w:p>
+      <w:r>
+        <w:t>module.exports = { TERMS_VERSION };</w:t>
+      </w:r>
+    </w:p>
+    <w:p>
+      <w:r>
+        <w:t>Find this in backend/controllers/userController.js:</w:t>
+      </w:r>
+    </w:p>
+    <w:p/>
+    <w:p>
+      <w:r>
+        <w:t>js</w:t>
+      </w:r>
+    </w:p>
+    <w:p>
+      <w:r>
+        <w:t>// Bump this string whenever the Terms of Service or Privacy Policy</w:t>
+      </w:r>
+    </w:p>
+    <w:p>
+      <w:r>
+        <w:t>// change materially. Every account whose stored termsVersion differs</w:t>
+      </w:r>
+    </w:p>
+    <w:p>
+      <w:r>
+        <w:t>// is prompted to accept again. Also update legalLastUpdated in</w:t>
+      </w:r>
+    </w:p>
+    <w:p>
+      <w:r>
+        <w:t>// frontend/src/data/siteConfig.js at the same time.</w:t>
+      </w:r>
+    </w:p>
+    <w:p>
+      <w:r>
+        <w:t>const TERMS_VERSION = '2026-10-24';</w:t>
+      </w:r>
+    </w:p>
+    <w:p>
+      <w:r>
+        <w:t>Replace with:</w:t>
+      </w:r>
+    </w:p>
+    <w:p/>
+    <w:p>
+      <w:r>
+        <w:t>js</w:t>
+      </w:r>
+    </w:p>
+    <w:p>
+      <w:r>
+        <w:t>// Current Terms version lives in backend/config/terms.js (shared with</w:t>
+      </w:r>
+    </w:p>
+    <w:p>
+      <w:r>
+        <w:t>// orderController and enquiryController, which enforce it server-side).</w:t>
+      </w:r>
+    </w:p>
+    <w:p>
+      <w:r>
+        <w:t>const { TERMS_VERSION } = require('../config/terms');</w:t>
+      </w:r>
+    </w:p>
+    <w:p>
+      <w:r>
+        <w:t>Find this in backend/controllers/orderController.js:</w:t>
+      </w:r>
+    </w:p>
+    <w:p/>
+    <w:p>
+      <w:r>
+        <w:t>js</w:t>
+      </w:r>
+    </w:p>
+    <w:p>
+      <w:r>
+        <w:t>const Notification = require('../models/Notification');</w:t>
+      </w:r>
+    </w:p>
+    <w:p>
+      <w:r>
+        <w:t>Replace with:</w:t>
+      </w:r>
+    </w:p>
+    <w:p/>
+    <w:p>
+      <w:r>
+        <w:t>js</w:t>
+      </w:r>
+    </w:p>
+    <w:p>
+      <w:r>
+        <w:t>const Notification = require('../models/Notification');</w:t>
+      </w:r>
+    </w:p>
+    <w:p>
+      <w:r>
+        <w:t>const { TERMS_VERSION } = require('../config/terms');</w:t>
+      </w:r>
+    </w:p>
+    <w:p>
+      <w:r>
+        <w:lastRenderedPageBreak/>
+        <w:t>Find this in backend/controllers/orderController.js:</w:t>
+      </w:r>
+    </w:p>
+    <w:p/>
+    <w:p>
+      <w:r>
+        <w:t>js</w:t>
+      </w:r>
+    </w:p>
+    <w:p>
+      <w:r>
+        <w:t xml:space="preserve">    if (!orderItems || orderItems.length === 0) {</w:t>
+      </w:r>
+    </w:p>
+    <w:p>
+      <w:r>
+        <w:t xml:space="preserve">      return res.status(400).json({ message: 'No order items provided' });</w:t>
+      </w:r>
+    </w:p>
+    <w:p>
+      <w:r>
+        <w:t xml:space="preserve">    }</w:t>
+      </w:r>
+    </w:p>
+    <w:p>
+      <w:r>
+        <w:t>Replace with:</w:t>
+      </w:r>
+    </w:p>
+    <w:p/>
+    <w:p>
+      <w:r>
+        <w:t>js</w:t>
+      </w:r>
+    </w:p>
+    <w:p>
+      <w:r>
+        <w:t xml:space="preserve">    // ── Terms gate (ISS-091) ────────────────────────────────────────────</w:t>
+      </w:r>
+    </w:p>
+    <w:p>
+      <w:r>
+        <w:t xml:space="preserve">    // The frontend prompts first, but this is the real wall (rule 14).</w:t>
+      </w:r>
+    </w:p>
+    <w:p>
+      <w:r>
+        <w:t xml:space="preserve">    // Runs before any stock is touched. 403 (not 401) so the session-expiry</w:t>
+      </w:r>
+    </w:p>
+    <w:p>
+      <w:r>
+        <w:t xml:space="preserve">    // interceptor does not mistake it for a logged-out session.</w:t>
+      </w:r>
+    </w:p>
+    <w:p>
+      <w:r>
+        <w:t xml:space="preserve">    if (req.user.termsVersion !== TERMS_VERSION) {</w:t>
+      </w:r>
+    </w:p>
+    <w:p>
+      <w:r>
+        <w:t xml:space="preserve">      return res.status(403).json({</w:t>
+      </w:r>
+    </w:p>
+    <w:p>
+      <w:r>
+        <w:t xml:space="preserve">        message: 'Please accept the updated Terms of Service and Privacy Policy before placing an order.',</w:t>
+      </w:r>
+    </w:p>
+    <w:p>
+      <w:r>
+        <w:t xml:space="preserve">      });</w:t>
+      </w:r>
+    </w:p>
+    <w:p>
+      <w:r>
+        <w:t xml:space="preserve">    }</w:t>
+      </w:r>
+    </w:p>
+    <w:p/>
+    <w:p>
+      <w:r>
+        <w:t xml:space="preserve">    if (!orderItems || orderItems.length === 0) {</w:t>
+      </w:r>
+    </w:p>
+    <w:p>
+      <w:r>
+        <w:t xml:space="preserve">      return res.status(400).json({ message: 'No order items provided' });</w:t>
+      </w:r>
+    </w:p>
+    <w:p>
+      <w:r>
+        <w:t xml:space="preserve">    }</w:t>
+      </w:r>
+    </w:p>
+    <w:p>
+      <w:r>
+        <w:t>Find this in backend/controllers/enquiryController.js:</w:t>
+      </w:r>
+    </w:p>
+    <w:p/>
+    <w:p>
+      <w:r>
+        <w:t>js</w:t>
+      </w:r>
+    </w:p>
+    <w:p>
+      <w:r>
+        <w:lastRenderedPageBreak/>
+        <w:t>const leoProfanity = require('leo-profanity');</w:t>
+      </w:r>
+    </w:p>
+    <w:p>
+      <w:r>
+        <w:t>Replace with:</w:t>
+      </w:r>
+    </w:p>
+    <w:p/>
+    <w:p>
+      <w:r>
+        <w:t>js</w:t>
+      </w:r>
+    </w:p>
+    <w:p>
+      <w:r>
+        <w:t>const leoProfanity = require('leo-profanity');</w:t>
+      </w:r>
+    </w:p>
+    <w:p>
+      <w:r>
+        <w:t>const { TERMS_VERSION } = require('../config/terms');</w:t>
+      </w:r>
+    </w:p>
+    <w:p>
+      <w:r>
+        <w:t>Find this in backend/controllers/enquiryController.js:</w:t>
+      </w:r>
+    </w:p>
+    <w:p/>
+    <w:p>
+      <w:r>
+        <w:t>js</w:t>
+      </w:r>
+    </w:p>
+    <w:p>
+      <w:r>
+        <w:t xml:space="preserve">    if (!type || !name || !email) {</w:t>
+      </w:r>
+    </w:p>
+    <w:p>
+      <w:r>
+        <w:t xml:space="preserve">      return res.status(400).json({</w:t>
+      </w:r>
+    </w:p>
+    <w:p>
+      <w:r>
+        <w:t xml:space="preserve">        message: 'type, name, and email are required',</w:t>
+      </w:r>
+    </w:p>
+    <w:p>
+      <w:r>
+        <w:t xml:space="preserve">      });</w:t>
+      </w:r>
+    </w:p>
+    <w:p>
+      <w:r>
+        <w:t xml:space="preserve">    }</w:t>
+      </w:r>
+    </w:p>
+    <w:p>
+      <w:r>
+        <w:t>Replace with:</w:t>
+      </w:r>
+    </w:p>
+    <w:p/>
+    <w:p>
+      <w:r>
+        <w:t>js</w:t>
+      </w:r>
+    </w:p>
+    <w:p>
+      <w:r>
+        <w:t xml:space="preserve">    if (!type || !name || !email) {</w:t>
+      </w:r>
+    </w:p>
+    <w:p>
+      <w:r>
+        <w:t xml:space="preserve">      return res.status(400).json({</w:t>
+      </w:r>
+    </w:p>
+    <w:p>
+      <w:r>
+        <w:t xml:space="preserve">        message: 'type, name, and email are required',</w:t>
+      </w:r>
+    </w:p>
+    <w:p>
+      <w:r>
+        <w:t xml:space="preserve">      });</w:t>
+      </w:r>
+    </w:p>
+    <w:p>
+      <w:r>
+        <w:t xml:space="preserve">    }</w:t>
+      </w:r>
+    </w:p>
+    <w:p/>
+    <w:p>
+      <w:r>
+        <w:t xml:space="preserve">    // ── Terms gate for seller applications only (ISS-091) ─────</w:t>
+      </w:r>
+    </w:p>
+    <w:p>
+      <w:r>
+        <w:t xml:space="preserve">    // Support, contact and bulk-order forms stay open to everyone, since</w:t>
+      </w:r>
+    </w:p>
+    <w:p>
+      <w:r>
+        <w:t xml:space="preserve">    // blocking someone from asking for help would be wrong.</w:t>
+      </w:r>
+    </w:p>
+    <w:p>
+      <w:r>
+        <w:lastRenderedPageBreak/>
+        <w:t xml:space="preserve">    if (type === 'seller_application' &amp;&amp; req.user.termsVersion !== TERMS_VERSION) {</w:t>
+      </w:r>
+    </w:p>
+    <w:p>
+      <w:r>
+        <w:t xml:space="preserve">      return res.status(403).json({</w:t>
+      </w:r>
+    </w:p>
+    <w:p>
+      <w:r>
+        <w:t xml:space="preserve">        message: 'Please accept the updated Terms of Service and Privacy Policy before applying to sell.',</w:t>
+      </w:r>
+    </w:p>
+    <w:p>
+      <w:r>
+        <w:t xml:space="preserve">      });</w:t>
+      </w:r>
+    </w:p>
+    <w:p>
+      <w:r>
+        <w:t xml:space="preserve">    }</w:t>
+      </w:r>
+    </w:p>
+    <w:p>
+      <w:r>
+        <w:t>This works because the protect middleware attaches the full user document (minus password) to req.user, so termsVersion is already there.</w:t>
+      </w:r>
+    </w:p>
+    <w:p/>
+    <w:p>
+      <w:r>
+        <w:t>5. Items 9 and 10 from the ISS-091 checklist</w:t>
+      </w:r>
+    </w:p>
+    <w:p>
+      <w:r>
+        <w:t>Item 9, admin token expiry (about 1 day). This avoids pasting a token into a website.</w:t>
+      </w:r>
+    </w:p>
+    <w:p/>
+    <w:p>
+      <w:r>
+        <w:t>Log out, then log in as admin. Old tokens keep their old expiry, so a fresh login is required.</w:t>
+      </w:r>
+    </w:p>
+    <w:p>
+      <w:r>
+        <w:t>Press F12 and open the Console tab.</w:t>
+      </w:r>
+    </w:p>
+    <w:p>
+      <w:r>
+        <w:t>Paste this and press Enter:</w:t>
+      </w:r>
+    </w:p>
+    <w:p>
+      <w:r>
+        <w:t>js</w:t>
+      </w:r>
+    </w:p>
+    <w:p>
+      <w:r>
+        <w:t>const t = JSON.parse(localStorage.getItem('userInfo')).token; const p = JSON.parse(atob(t.split('.')[1])); console.log('Lifetime:', (p.exp - p.iat) / 86400, 'days');</w:t>
+      </w:r>
+    </w:p>
+    <w:p>
+      <w:r>
+        <w:t>Admin should print 1. Repeat with a seller account (expect 3) and a buyer (expect 7). Registering a brand-new account should also give 7. I fixed that call in the last round, since it was ignoring the role before.</w:t>
+      </w:r>
+    </w:p>
+    <w:p>
+      <w:r>
+        <w:t>Item 10, changing the version re-prompts everyone. My earlier wording said “refresh”, and that was wrong. The termsUpToDate flag comes from the server only when you log in or save your profile. A refresh just reads the old copy in localStorage.</w:t>
+      </w:r>
+    </w:p>
+    <w:p/>
+    <w:p>
+      <w:r>
+        <w:t>Open backend/config/terms.js and change '2026-10-24' to '2026-10-25'. Nodemon restarts the server.</w:t>
+      </w:r>
+    </w:p>
+    <w:p>
+      <w:r>
+        <w:t>Log out and log in again with a normal account. The “updated Terms” modal appears.</w:t>
+      </w:r>
+    </w:p>
+    <w:p>
+      <w:r>
+        <w:lastRenderedPageBreak/>
+        <w:t>If it doesn’t, you dismissed it earlier in this tab. Run sessionStorage.removeItem('shopzone_terms_prompt_dismissed') in the Console and reload, or use a new tab.</w:t>
+      </w:r>
+    </w:p>
+    <w:p>
+      <w:r>
+        <w:t>Try Place Order without accepting. It is blocked, and now blocked by the server too.</w:t>
+      </w:r>
+    </w:p>
+    <w:p>
+      <w:r>
+        <w:t>Click I accept, then check in Compass that termsVersion is 2026-10-25.</w:t>
+      </w:r>
+    </w:p>
+    <w:p>
+      <w:r>
+        <w:t>Set the version back afterwards, or leave it as the new real version.</w:t>
+      </w:r>
+    </w:p>
+    <w:p>
+      <w:r>
+        <w:t>What this means in practice: a version bump re-prompts people at their next login, not instantly mid-session. That is fine for legal text, and the server gate still catches anyone who tries to order before they log in again.</w:t>
+      </w:r>
+    </w:p>
+    <w:p/>
+    <w:p>
+      <w:r>
+        <w:t>Build steps: this closes the server-side half of ISS-091. I’m adding ISS-092, optional UI must never be able to break the app, with two standing rules for later sessions:</w:t>
+      </w:r>
+    </w:p>
+    <w:p/>
+    <w:p>
+      <w:r>
+        <w:t>Any non-essential widget gets neutral names (no “cookie”, “banner”, “ad”, “track”, “consent”).</w:t>
+      </w:r>
+    </w:p>
+    <w:p>
+      <w:r>
+        <w:t>Any non-essential widget is mounted through OptionalBoundary with lazy.</w:t>
+      </w:r>
+    </w:p>
+    <w:p>
+      <w:r>
+        <w:t>The remaining question for you is the name CookiePolicyPage.jsx. It’s imported statically, so a blocker could hit it in dev too. It hasn’t broken anything so far, and I’d rename it to StoragePolicyPage.jsx only if the Network tab shows it blocked.</w:t>
+      </w:r>
+    </w:p>
+    <w:p/>
+    <w:p>
+      <w:r>
+        <w:t>Testing checklist:</w:t>
+      </w:r>
+    </w:p>
+    <w:p/>
+    <w:p>
+      <w:r>
+        <w:t>Delete the old CookieBanner folder and confirm the new files exist at the paths above.</w:t>
+      </w:r>
+    </w:p>
+    <w:p>
+      <w:r>
+        <w:t>With Ghostery on, hard-refresh with Ctrl+Shift+R. The site loads past the splash screen. The notice may or may not appear, and either is fine.</w:t>
+      </w:r>
+    </w:p>
+    <w:p>
+      <w:r>
+        <w:t>With Ghostery off, delete shopzone_cookie_consent from Local Storage and refresh. The notice appears with white text, and both buttons work.</w:t>
+      </w:r>
+    </w:p>
+    <w:p>
+      <w:r>
+        <w:t>Check the console for the warning “Optional component failed to load”. It only appears if a blocker actually blocked it, and the site should still work.</w:t>
+      </w:r>
+    </w:p>
+    <w:p>
+      <w:r>
+        <w:lastRenderedPageBreak/>
+        <w:t>As a user on the old version, try Place Order. The modal appears, and a direct API call returns 403.</w:t>
+      </w:r>
+    </w:p>
+    <w:p>
+      <w:r>
+        <w:t>Submit a seller application as an un-accepted account. It is refused with the 403 message. A Contact form submission from the same account still works.</w:t>
+      </w:r>
+    </w:p>
+    <w:p>
+      <w:r>
+        <w:t>Run the item 9 and item 10 steps above.</w:t>
+      </w:r>
+    </w:p>
+    <w:p>
+      <w:r>
+        <w:t>Run npm run build then npm run preview, and load the preview with Ghostery on, to confirm the production build is fine.</w:t>
+      </w:r>
+    </w:p>
+    <w:p>
+      <w:r>
+        <w:t>Files needed next: none for this. When you’re ready for ISS-074 (search filters and sort), paste:</w:t>
+      </w:r>
+    </w:p>
+    <w:p/>
+    <w:p>
+      <w:r>
+        <w:t>backend/controllers/productController.js</w:t>
+      </w:r>
+    </w:p>
+    <w:p>
+      <w:r>
+        <w:t>backend/routes/productRoutes.js</w:t>
+      </w:r>
+    </w:p>
+    <w:p>
+      <w:r>
+        <w:t>frontend/src/redux/slices/productSlice.js</w:t>
+      </w:r>
+    </w:p>
+    <w:p>
+      <w:r>
+        <w:t>frontend/src/components/ProductCard/ProductCard.jsx</w:t>
+      </w:r>
+    </w:p>
+    <w:p>
+      <w:r>
+        <w:t>frontend/src/components/OfferCard/OfferCard.jsx</w:t>
+      </w:r>
+    </w:p>
+    <w:p>
+      <w:r>
+        <w:t>frontend/src/pages/HomePage.jsx</w:t>
       </w:r>
     </w:p>
     <w:p/>

</xml_diff>